<commit_message>
Added final combined PPT
</commit_message>
<xml_diff>
--- a/final documentaion.docx
+++ b/final documentaion.docx
@@ -276,7 +276,14 @@
           <w:b/>
           <w:color w:val="BE0000"/>
         </w:rPr>
-        <w:t>University Academic Management Database Application</w:t>
+        <w:t>File Data Ana</w:t>
+      </w:r>
+      <w:r>
+        <w:rPr>
+          <w:b/>
+          <w:color w:val="BE0000"/>
+        </w:rPr>
+        <w:t>lyzer System</w:t>
       </w:r>
       <w:r>
         <w:rPr>
@@ -408,19 +415,8 @@
                 <w:sz w:val="22"/>
                 <w:szCs w:val="24"/>
               </w:rPr>
-              <w:t xml:space="preserve"> </w:t>
-            </w:r>
-            <w:proofErr w:type="gramStart"/>
-            <w:r>
-              <w:rPr>
-                <w:b/>
-                <w:color w:val="16365B"/>
-                <w:sz w:val="22"/>
-                <w:szCs w:val="24"/>
-              </w:rPr>
-              <w:t>K.JASWANTH</w:t>
-            </w:r>
-            <w:proofErr w:type="gramEnd"/>
+              <w:t xml:space="preserve"> K.JASWANTH</w:t>
+            </w:r>
           </w:p>
         </w:tc>
         <w:tc>
@@ -499,7 +495,6 @@
                 <w:szCs w:val="24"/>
               </w:rPr>
             </w:pPr>
-            <w:proofErr w:type="gramStart"/>
             <w:r>
               <w:rPr>
                 <w:b/>
@@ -509,7 +504,6 @@
               </w:rPr>
               <w:t>B.NIKHIL</w:t>
             </w:r>
-            <w:proofErr w:type="gramEnd"/>
           </w:p>
         </w:tc>
         <w:tc>
@@ -588,7 +582,6 @@
                 <w:szCs w:val="24"/>
               </w:rPr>
             </w:pPr>
-            <w:proofErr w:type="gramStart"/>
             <w:r>
               <w:rPr>
                 <w:b/>
@@ -596,17 +589,7 @@
                 <w:sz w:val="22"/>
                 <w:szCs w:val="24"/>
               </w:rPr>
-              <w:t>A.PRANAV</w:t>
-            </w:r>
-            <w:proofErr w:type="gramEnd"/>
-            <w:r>
-              <w:rPr>
-                <w:b/>
-                <w:color w:val="16365B"/>
-                <w:sz w:val="22"/>
-                <w:szCs w:val="24"/>
-              </w:rPr>
-              <w:t xml:space="preserve"> ADITYA</w:t>
+              <w:t>A.PRANAV ADITYA</w:t>
             </w:r>
           </w:p>
         </w:tc>
@@ -831,19 +814,8 @@
         <w:ind w:left="567"/>
       </w:pPr>
       <w:r>
-        <w:t xml:space="preserve">Dr. </w:t>
-      </w:r>
-      <w:r>
-        <w:t>Phani Sridhar Addepalli</w:t>
-      </w:r>
-      <w:r>
-        <w:t xml:space="preserve">, </w:t>
-      </w:r>
-      <w:proofErr w:type="spellStart"/>
-      <w:r>
-        <w:t>Ph.D</w:t>
-      </w:r>
-      <w:proofErr w:type="spellEnd"/>
+        <w:t xml:space="preserve">Vydehi k </w:t>
+      </w:r>
       <w:r>
         <w:t>,</w:t>
       </w:r>
@@ -1519,7 +1491,6 @@
                 <w:szCs w:val="24"/>
               </w:rPr>
             </w:pPr>
-            <w:proofErr w:type="gramStart"/>
             <w:r>
               <w:rPr>
                 <w:bCs/>
@@ -1528,7 +1499,6 @@
               </w:rPr>
               <w:t>K.JASWANTH</w:t>
             </w:r>
-            <w:proofErr w:type="gramEnd"/>
           </w:p>
         </w:tc>
         <w:tc>
@@ -1629,7 +1599,6 @@
                 <w:szCs w:val="24"/>
               </w:rPr>
             </w:pPr>
-            <w:proofErr w:type="gramStart"/>
             <w:r>
               <w:rPr>
                 <w:bCs/>
@@ -1638,7 +1607,6 @@
               </w:rPr>
               <w:t>B.NIKHIL</w:t>
             </w:r>
-            <w:proofErr w:type="gramEnd"/>
           </w:p>
         </w:tc>
         <w:tc>
@@ -1739,23 +1707,13 @@
                 <w:szCs w:val="24"/>
               </w:rPr>
             </w:pPr>
-            <w:proofErr w:type="gramStart"/>
             <w:r>
               <w:rPr>
                 <w:bCs/>
                 <w:sz w:val="22"/>
                 <w:szCs w:val="24"/>
               </w:rPr>
-              <w:t>A.PRANAV</w:t>
-            </w:r>
-            <w:proofErr w:type="gramEnd"/>
-            <w:r>
-              <w:rPr>
-                <w:bCs/>
-                <w:sz w:val="22"/>
-                <w:szCs w:val="24"/>
-              </w:rPr>
-              <w:t xml:space="preserve"> ADITYA</w:t>
+              <w:t>A.PRANAV ADITYA</w:t>
             </w:r>
           </w:p>
         </w:tc>
@@ -1909,7 +1867,6 @@
         <w:t xml:space="preserve">Dr. Phani Sridhar Addepalli, </w:t>
       </w:r>
       <w:proofErr w:type="spellStart"/>
-      <w:proofErr w:type="gramStart"/>
       <w:r>
         <w:rPr>
           <w:b/>
@@ -1918,7 +1875,6 @@
         <w:t>Ph.D</w:t>
       </w:r>
       <w:proofErr w:type="spellEnd"/>
-      <w:proofErr w:type="gramEnd"/>
       <w:r>
         <w:rPr>
           <w:b/>
@@ -2120,23 +2076,7 @@
           <w:b/>
           <w:szCs w:val="24"/>
         </w:rPr>
-        <w:t xml:space="preserve"> </w:t>
-      </w:r>
-      <w:proofErr w:type="gramStart"/>
-      <w:r>
-        <w:rPr>
-          <w:b/>
-          <w:szCs w:val="24"/>
-        </w:rPr>
-        <w:t>and  Dr</w:t>
-      </w:r>
-      <w:proofErr w:type="gramEnd"/>
-      <w:r>
-        <w:rPr>
-          <w:b/>
-          <w:szCs w:val="24"/>
-        </w:rPr>
-        <w:t xml:space="preserve"> </w:t>
+        <w:t xml:space="preserve"> and  Dr </w:t>
       </w:r>
       <w:proofErr w:type="spellStart"/>
       <w:r>
@@ -2424,14 +2364,12 @@
         </w:rPr>
         <w:t xml:space="preserve">School of </w:t>
       </w:r>
-      <w:proofErr w:type="gramStart"/>
       <w:r>
         <w:rPr>
           <w:b/>
         </w:rPr>
         <w:t>Computing</w:t>
       </w:r>
-      <w:proofErr w:type="gramEnd"/>
       <w:r>
         <w:rPr>
           <w:b/>
@@ -2439,15 +2377,7 @@
         <w:t xml:space="preserve"> </w:t>
       </w:r>
       <w:r>
-        <w:t xml:space="preserve">for their encouragement and support </w:t>
-      </w:r>
-      <w:proofErr w:type="gramStart"/>
-      <w:r>
-        <w:t>during the course of</w:t>
-      </w:r>
-      <w:proofErr w:type="gramEnd"/>
-      <w:r>
-        <w:t xml:space="preserve"> our project.</w:t>
+        <w:t>for their encouragement and support during the course of our project.</w:t>
       </w:r>
     </w:p>
     <w:p>
@@ -2590,7 +2520,6 @@
         </w:rPr>
         <w:t xml:space="preserve"> </w:t>
       </w:r>
-      <w:proofErr w:type="gramStart"/>
       <w:r>
         <w:rPr>
           <w:b/>
@@ -2616,15 +2545,7 @@
           <w:b/>
           <w:spacing w:val="40"/>
         </w:rPr>
-        <w:t xml:space="preserve"> </w:t>
-      </w:r>
-      <w:proofErr w:type="gramEnd"/>
-      <w:r>
-        <w:rPr>
-          <w:b/>
-          <w:spacing w:val="40"/>
-        </w:rPr>
-        <w:t xml:space="preserve">           </w:t>
+        <w:t xml:space="preserve">            </w:t>
       </w:r>
       <w:r>
         <w:rPr>
@@ -2924,15 +2845,7 @@
         <w:ind w:right="580"/>
       </w:pPr>
       <w:r>
-        <w:t xml:space="preserve">The File Data Analyzer System is a Python-based, menu-driven application designed to provide a common workflow for handling and analyzing multiple file formats. The </w:t>
-      </w:r>
-      <w:proofErr w:type="gramStart"/>
-      <w:r>
-        <w:t>supplied implementation</w:t>
-      </w:r>
-      <w:proofErr w:type="gramEnd"/>
-      <w:r>
-        <w:t xml:space="preserve"> supports CSV, Excel, JSON and TXT files. It provides Google </w:t>
+        <w:t xml:space="preserve">The File Data Analyzer System is a Python-based, menu-driven application designed to provide a common workflow for handling and analyzing multiple file formats. The supplied implementation supports CSV, Excel, JSON and TXT files. It provides Google </w:t>
       </w:r>
       <w:proofErr w:type="spellStart"/>
       <w:r>
@@ -2940,15 +2853,7 @@
       </w:r>
       <w:proofErr w:type="spellEnd"/>
       <w:r>
-        <w:t xml:space="preserve"> file upload, automatic file-format detection, dataset overview, dataset information, data preprocessing, statistical analysis, filtering, category analysis, numerical analysis, simple text-based visualization, TXT text analysis and batch processing. Tabular files are processed using Pandas and NumPy, while TXT files are handled with Python file operations and basic text statistics. The system maintains the currently loaded file and data and exposes its functionality through a console-based main menu. The project is intended for </w:t>
-      </w:r>
-      <w:proofErr w:type="gramStart"/>
-      <w:r>
-        <w:t>exploratory</w:t>
-      </w:r>
-      <w:proofErr w:type="gramEnd"/>
-      <w:r>
-        <w:t xml:space="preserve"> and descriptive analysis rather than predictive machine learning</w:t>
+        <w:t xml:space="preserve"> file upload, automatic file-format detection, dataset overview, dataset information, data preprocessing, statistical analysis, filtering, category analysis, numerical analysis, simple text-based visualization, TXT text analysis and batch processing. Tabular files are processed using Pandas and NumPy, while TXT files are handled with Python file operations and basic text statistics. The system maintains the currently loaded file and data and exposes its functionality through a console-based main menu. The project is intended for exploratory and descriptive analysis rather than predictive machine learning</w:t>
       </w:r>
     </w:p>
     <w:p>
@@ -4915,35 +4820,7 @@
         <w:rPr>
           <w:szCs w:val="24"/>
         </w:rPr>
-        <w:t xml:space="preserve">The project focuses on </w:t>
-      </w:r>
-      <w:proofErr w:type="gramStart"/>
-      <w:r>
-        <w:rPr>
-          <w:szCs w:val="24"/>
-        </w:rPr>
-        <w:t>exploratory</w:t>
-      </w:r>
-      <w:proofErr w:type="gramEnd"/>
-      <w:r>
-        <w:rPr>
-          <w:szCs w:val="24"/>
-        </w:rPr>
-        <w:t xml:space="preserve"> and descriptive data analysis rather than predictive machine learning. It covers local handling of CSV, Excel, JSON and TXT files. For tabular data it performs structural inspection, preprocessing, statistical, categorical and numerical analysis. For TXT files it </w:t>
-      </w:r>
-      <w:proofErr w:type="gramStart"/>
-      <w:r>
-        <w:rPr>
-          <w:szCs w:val="24"/>
-        </w:rPr>
-        <w:t>reports</w:t>
-      </w:r>
-      <w:proofErr w:type="gramEnd"/>
-      <w:r>
-        <w:rPr>
-          <w:szCs w:val="24"/>
-        </w:rPr>
-        <w:t xml:space="preserve"> basic text statistics. The </w:t>
+        <w:t xml:space="preserve">The project focuses on exploratory and descriptive data analysis rather than predictive machine learning. It covers local handling of CSV, Excel, JSON and TXT files. For tabular data it performs structural inspection, preprocessing, statistical, categorical and numerical analysis. For TXT files it reports basic text statistics. The </w:t>
       </w:r>
     </w:p>
     <w:p>
@@ -6312,8 +6189,6 @@
       </w:r>
       <w:r>
         <w:br/>
-      </w:r>
-      <w:r>
         <w:t>5.6 Data Visualization Implementation .......................................................... 12</w:t>
       </w:r>
       <w:r>
@@ -6554,11 +6429,6 @@
           <w:rFonts w:eastAsia="Courier New"/>
         </w:rPr>
         <w:br/>
-      </w:r>
-      <w:r>
-        <w:rPr>
-          <w:rFonts w:eastAsia="Courier New"/>
-        </w:rPr>
         <w:t xml:space="preserve">    """</w:t>
       </w:r>
       <w:r>
@@ -6707,11 +6577,6 @@
           <w:rFonts w:eastAsia="Courier New"/>
         </w:rPr>
         <w:br/>
-      </w:r>
-      <w:r>
-        <w:rPr>
-          <w:rFonts w:eastAsia="Courier New"/>
-        </w:rPr>
         <w:t xml:space="preserve">        return pd.read_csv(filename, encoding="latin1")</w:t>
       </w:r>
       <w:r>
@@ -6887,11 +6752,6 @@
         </w:rPr>
         <w:lastRenderedPageBreak/>
         <w:br/>
-      </w:r>
-      <w:r>
-        <w:rPr>
-          <w:rFonts w:eastAsia="Courier New"/>
-        </w:rPr>
         <w:t xml:space="preserve">    if filename in DATA_CACHE:</w:t>
       </w:r>
       <w:r>
@@ -7039,11 +6899,6 @@
           <w:rFonts w:eastAsia="Courier New"/>
         </w:rPr>
         <w:br/>
-      </w:r>
-      <w:r>
-        <w:rPr>
-          <w:rFonts w:eastAsia="Courier New"/>
-        </w:rPr>
         <w:t xml:space="preserve">    DATA_CACHE[filename] = data</w:t>
       </w:r>
       <w:r>
@@ -7152,11 +7007,6 @@
           <w:rFonts w:eastAsia="Courier New"/>
         </w:rPr>
         <w:br/>
-      </w:r>
-      <w:r>
-        <w:rPr>
-          <w:rFonts w:eastAsia="Courier New"/>
-        </w:rPr>
         <w:t xml:space="preserve">    print("CSV FILE PROCESSING")</w:t>
       </w:r>
       <w:r>
@@ -7292,11 +7142,6 @@
           <w:rFonts w:eastAsia="Courier New"/>
         </w:rPr>
         <w:br/>
-      </w:r>
-      <w:r>
-        <w:rPr>
-          <w:rFonts w:eastAsia="Courier New"/>
-        </w:rPr>
         <w:t xml:space="preserve">    print(f"Duplicate Rows : {int(df.duplicated().sum())}")</w:t>
       </w:r>
       <w:r>
@@ -7518,11 +7363,6 @@
           <w:rFonts w:eastAsia="Courier New"/>
         </w:rPr>
         <w:br/>
-      </w:r>
-      <w:r>
-        <w:rPr>
-          <w:rFonts w:eastAsia="Courier New"/>
-        </w:rPr>
         <w:t xml:space="preserve">        numeric_columns = df.select_dtypes(</w:t>
       </w:r>
       <w:r>
@@ -7662,11 +7502,6 @@
           <w:rFonts w:eastAsia="Courier New"/>
         </w:rPr>
         <w:br/>
-      </w:r>
-      <w:r>
-        <w:rPr>
-          <w:rFonts w:eastAsia="Courier New"/>
-        </w:rPr>
         <w:t xml:space="preserve">    print(f"Mean Value        : {mean_value:.2f}")</w:t>
       </w:r>
       <w:r>
@@ -7795,11 +7630,6 @@
           <w:rFonts w:eastAsia="Courier New"/>
         </w:rPr>
         <w:br/>
-      </w:r>
-      <w:r>
-        <w:rPr>
-          <w:rFonts w:eastAsia="Courier New"/>
-        </w:rPr>
         <w:t xml:space="preserve">    print_separator()</w:t>
       </w:r>
       <w:r>
@@ -7947,11 +7777,6 @@
           <w:rFonts w:eastAsia="Courier New"/>
         </w:rPr>
         <w:br/>
-      </w:r>
-      <w:r>
-        <w:rPr>
-          <w:rFonts w:eastAsia="Courier New"/>
-        </w:rPr>
         <w:t xml:space="preserve">    for column in numeric_df.columns:</w:t>
       </w:r>
       <w:r>
@@ -8174,11 +7999,6 @@
           <w:rFonts w:eastAsia="Courier New"/>
         </w:rPr>
         <w:br/>
-      </w:r>
-      <w:r>
-        <w:rPr>
-          <w:rFonts w:eastAsia="Courier New"/>
-        </w:rPr>
         <w:t xml:space="preserve">    print(f"Files Detected : {len(file_list)}")</w:t>
       </w:r>
       <w:r>
@@ -8346,11 +8166,6 @@
           <w:rFonts w:eastAsia="Courier New"/>
         </w:rPr>
         <w:br/>
-      </w:r>
-      <w:r>
-        <w:rPr>
-          <w:rFonts w:eastAsia="Courier New"/>
-        </w:rPr>
         <w:t xml:space="preserve">    summary_data = []</w:t>
       </w:r>
       <w:r>
@@ -8503,11 +8318,6 @@
           <w:rFonts w:eastAsia="Courier New"/>
         </w:rPr>
         <w:br/>
-      </w:r>
-      <w:r>
-        <w:rPr>
-          <w:rFonts w:eastAsia="Courier New"/>
-        </w:rPr>
         <w:t xml:space="preserve">                columns = ""</w:t>
       </w:r>
       <w:r>
@@ -8615,11 +8425,6 @@
           <w:rFonts w:eastAsia="Courier New"/>
         </w:rPr>
         <w:br/>
-      </w:r>
-      <w:r>
-        <w:rPr>
-          <w:rFonts w:eastAsia="Courier New"/>
-        </w:rPr>
         <w:t xml:space="preserve">            # ------------------------------------------------</w:t>
       </w:r>
       <w:r>
@@ -8747,11 +8552,6 @@
           <w:rFonts w:eastAsia="Courier New"/>
         </w:rPr>
         <w:br/>
-      </w:r>
-      <w:r>
-        <w:rPr>
-          <w:rFonts w:eastAsia="Courier New"/>
-        </w:rPr>
         <w:t xml:space="preserve">                    "Type": file_type,</w:t>
       </w:r>
       <w:r>
@@ -8883,11 +8683,6 @@
         </w:rPr>
         <w:lastRenderedPageBreak/>
         <w:br/>
-      </w:r>
-      <w:r>
-        <w:rPr>
-          <w:rFonts w:eastAsia="Courier New"/>
-        </w:rPr>
         <w:t xml:space="preserve">            print(</w:t>
       </w:r>
       <w:r>
@@ -9117,11 +8912,6 @@
           <w:rFonts w:eastAsia="Courier New"/>
         </w:rPr>
         <w:br/>
-      </w:r>
-      <w:r>
-        <w:rPr>
-          <w:rFonts w:eastAsia="Courier New"/>
-        </w:rPr>
         <w:t xml:space="preserve">    print("DATA VISUALIZATION")</w:t>
       </w:r>
       <w:r>
@@ -9256,11 +9046,6 @@
           <w:rFonts w:eastAsia="Courier New"/>
         </w:rPr>
         <w:br/>
-      </w:r>
-      <w:r>
-        <w:rPr>
-          <w:rFonts w:eastAsia="Courier New"/>
-        </w:rPr>
         <w:t xml:space="preserve">    if len(numeric_columns) == 0:</w:t>
       </w:r>
       <w:r>
@@ -9423,11 +9208,6 @@
           <w:rFonts w:eastAsia="Courier New"/>
         </w:rPr>
         <w:br/>
-      </w:r>
-      <w:r>
-        <w:rPr>
-          <w:rFonts w:eastAsia="Courier New"/>
-        </w:rPr>
         <w:t xml:space="preserve">    print(f"Histogram generated for: {preferred_column}")</w:t>
       </w:r>
       <w:r>
@@ -9548,11 +9328,6 @@
           <w:rFonts w:eastAsia="Courier New"/>
         </w:rPr>
         <w:br/>
-      </w:r>
-      <w:r>
-        <w:rPr>
-          <w:rFonts w:eastAsia="Courier New"/>
-        </w:rPr>
         <w:t xml:space="preserve">            label="Sales"</w:t>
       </w:r>
       <w:r>
@@ -9785,11 +9560,6 @@
           <w:rFonts w:eastAsia="Courier New"/>
         </w:rPr>
         <w:br/>
-      </w:r>
-      <w:r>
-        <w:rPr>
-          <w:rFonts w:eastAsia="Courier New"/>
-        </w:rPr>
         <w:t xml:space="preserve">    for index, filename in enumerate(file_list, start=1):</w:t>
       </w:r>
       <w:r>
@@ -9937,11 +9707,6 @@
           <w:rFonts w:eastAsia="Courier New"/>
         </w:rPr>
         <w:br/>
-      </w:r>
-      <w:r>
-        <w:rPr>
-          <w:rFonts w:eastAsia="Courier New"/>
-        </w:rPr>
         <w:t xml:space="preserve">    print("FILE DATA ANALYZER SYSTEM")</w:t>
       </w:r>
       <w:r>
@@ -10516,8 +10281,6 @@
       </w:r>
       <w:r>
         <w:br/>
-      </w:r>
-      <w:r>
         <w:t>• Superstore-specific analysis depends on expected column names such as Sales, Quantity, Discount and Profit.</w:t>
       </w:r>
     </w:p>
@@ -12382,6 +12145,23 @@
 </file>
 
 <file path=customXml/item1.xml><?xml version="1.0" encoding="utf-8"?>
+<?mso-contentType ?>
+<FormTemplates xmlns="http://schemas.microsoft.com/sharepoint/v3/contenttype/forms">
+  <Display>DocumentLibraryForm</Display>
+  <Edit>DocumentLibraryForm</Edit>
+  <New>DocumentLibraryForm</New>
+</FormTemplates>
+</file>
+
+<file path=customXml/item2.xml><?xml version="1.0" encoding="utf-8"?>
+<p:properties xmlns:p="http://schemas.microsoft.com/office/2006/metadata/properties" xmlns:xsi="http://www.w3.org/2001/XMLSchema-instance" xmlns:pc="http://schemas.microsoft.com/office/infopath/2007/PartnerControls">
+  <documentManagement>
+    <_activity xmlns="9caa4048-c9c6-4c47-96b3-20bff02eeac6" xsi:nil="true"/>
+  </documentManagement>
+</p:properties>
+</file>
+
+<file path=customXml/item3.xml><?xml version="1.0" encoding="utf-8"?>
 <ct:contentTypeSchema xmlns:ct="http://schemas.microsoft.com/office/2006/metadata/contentType" xmlns:ma="http://schemas.microsoft.com/office/2006/metadata/properties/metaAttributes" ct:_="" ma:_="" ma:contentTypeName="Document" ma:contentTypeID="0x010100B435B0DC78564F4B82DD69BBEBAF973E" ma:contentTypeVersion="5" ma:contentTypeDescription="Create a new document." ma:contentTypeScope="" ma:versionID="8a05bbad9596b2b39b360ad36feb3f7b">
   <xsd:schema xmlns:xsd="http://www.w3.org/2001/XMLSchema" xmlns:xs="http://www.w3.org/2001/XMLSchema" xmlns:p="http://schemas.microsoft.com/office/2006/metadata/properties" xmlns:ns3="9caa4048-c9c6-4c47-96b3-20bff02eeac6" targetNamespace="http://schemas.microsoft.com/office/2006/metadata/properties" ma:root="true" ma:fieldsID="f0fd954bd085d466ff339aa5c81e24d6" ns3:_="">
     <xsd:import namespace="9caa4048-c9c6-4c47-96b3-20bff02eeac6"/>
@@ -12531,24 +12311,25 @@
 </ct:contentTypeSchema>
 </file>
 
-<file path=customXml/item2.xml><?xml version="1.0" encoding="utf-8"?>
-<p:properties xmlns:p="http://schemas.microsoft.com/office/2006/metadata/properties" xmlns:xsi="http://www.w3.org/2001/XMLSchema-instance" xmlns:pc="http://schemas.microsoft.com/office/infopath/2007/PartnerControls">
-  <documentManagement>
-    <_activity xmlns="9caa4048-c9c6-4c47-96b3-20bff02eeac6" xsi:nil="true"/>
-  </documentManagement>
-</p:properties>
+<file path=customXml/itemProps1.xml><?xml version="1.0" encoding="utf-8"?>
+<ds:datastoreItem xmlns:ds="http://schemas.openxmlformats.org/officeDocument/2006/customXml" ds:itemID="{30EA4F1A-2BD2-423B-8CEE-8CB241191099}">
+  <ds:schemaRefs>
+    <ds:schemaRef ds:uri="http://schemas.microsoft.com/sharepoint/v3/contenttype/forms"/>
+  </ds:schemaRefs>
+</ds:datastoreItem>
 </file>
 
-<file path=customXml/item3.xml><?xml version="1.0" encoding="utf-8"?>
-<?mso-contentType ?>
-<FormTemplates xmlns="http://schemas.microsoft.com/sharepoint/v3/contenttype/forms">
-  <Display>DocumentLibraryForm</Display>
-  <Edit>DocumentLibraryForm</Edit>
-  <New>DocumentLibraryForm</New>
-</FormTemplates>
+<file path=customXml/itemProps2.xml><?xml version="1.0" encoding="utf-8"?>
+<ds:datastoreItem xmlns:ds="http://schemas.openxmlformats.org/officeDocument/2006/customXml" ds:itemID="{60DEC4AC-261C-4DB4-B8A7-2A270E81D5C0}">
+  <ds:schemaRefs>
+    <ds:schemaRef ds:uri="http://schemas.microsoft.com/office/2006/metadata/properties"/>
+    <ds:schemaRef ds:uri="http://schemas.microsoft.com/office/infopath/2007/PartnerControls"/>
+    <ds:schemaRef ds:uri="9caa4048-c9c6-4c47-96b3-20bff02eeac6"/>
+  </ds:schemaRefs>
+</ds:datastoreItem>
 </file>
 
-<file path=customXml/itemProps1.xml><?xml version="1.0" encoding="utf-8"?>
+<file path=customXml/itemProps3.xml><?xml version="1.0" encoding="utf-8"?>
 <ds:datastoreItem xmlns:ds="http://schemas.openxmlformats.org/officeDocument/2006/customXml" ds:itemID="{AFD94A69-0B1F-4BE1-A004-BEA1BD14842B}">
   <ds:schemaRefs>
     <ds:schemaRef ds:uri="http://schemas.microsoft.com/office/2006/metadata/contentType"/>
@@ -12564,22 +12345,4 @@
     <ds:schemaRef ds:uri="http://schemas.microsoft.com/internal/obd"/>
   </ds:schemaRefs>
 </ds:datastoreItem>
-</file>
-
-<file path=customXml/itemProps2.xml><?xml version="1.0" encoding="utf-8"?>
-<ds:datastoreItem xmlns:ds="http://schemas.openxmlformats.org/officeDocument/2006/customXml" ds:itemID="{60DEC4AC-261C-4DB4-B8A7-2A270E81D5C0}">
-  <ds:schemaRefs>
-    <ds:schemaRef ds:uri="http://schemas.microsoft.com/office/2006/metadata/properties"/>
-    <ds:schemaRef ds:uri="http://schemas.microsoft.com/office/infopath/2007/PartnerControls"/>
-    <ds:schemaRef ds:uri="9caa4048-c9c6-4c47-96b3-20bff02eeac6"/>
-  </ds:schemaRefs>
-</ds:datastoreItem>
-</file>
-
-<file path=customXml/itemProps3.xml><?xml version="1.0" encoding="utf-8"?>
-<ds:datastoreItem xmlns:ds="http://schemas.openxmlformats.org/officeDocument/2006/customXml" ds:itemID="{30EA4F1A-2BD2-423B-8CEE-8CB241191099}">
-  <ds:schemaRefs>
-    <ds:schemaRef ds:uri="http://schemas.microsoft.com/sharepoint/v3/contenttype/forms"/>
-  </ds:schemaRefs>
-</ds:datastoreItem>
 </file>
</xml_diff>